<commit_message>
chore: add diagrams, UI mockups v2/v3, cover assets, and publishing updates
- Add assets/diagrams/ with all chapter diagram PPTX files
- Add UI mockup v2 and v3 iterations plus chapter-specific mockups (CH10, CH14)
- Add exported PNG mockups for CH01, CH02
- Update VIRON UI Mockups.docx and remove temp lock file
- Archive core/ chapters to core (from backup)/ for versioning
- Add publishing artifacts: Final Figure Index, book subtitle, back-cover blurb, ui-mockup-todo
- Update publishing/diagrams.md and publishing/ui-mockup-registry.md
- Add VIRON Book diagrams.pptx master file and cover reference PDF
- Add .next/ to viron-book .gitignore

Co-Authored-By: Claude Sonnet 4.6 <noreply@anthropic.com>
</commit_message>
<xml_diff>
--- a/assets/ui-mockups/VIRON UI Mockups.docx
+++ b/assets/ui-mockups/VIRON UI Mockups.docx
@@ -2,13 +2,14 @@
 <file path=word/document.xml><?xml version="1.0" encoding="utf-8"?>
 <w:document xmlns:wpc="http://schemas.microsoft.com/office/word/2010/wordprocessingCanvas" xmlns:cx="http://schemas.microsoft.com/office/drawing/2014/chartex" xmlns:cx1="http://schemas.microsoft.com/office/drawing/2015/9/8/chartex" xmlns:cx2="http://schemas.microsoft.com/office/drawing/2015/10/21/chartex" xmlns:cx3="http://schemas.microsoft.com/office/drawing/2016/5/9/chartex" xmlns:cx4="http://schemas.microsoft.com/office/drawing/2016/5/10/chartex" xmlns:cx5="http://schemas.microsoft.com/office/drawing/2016/5/11/chartex" xmlns:cx6="http://schemas.microsoft.com/office/drawing/2016/5/12/chartex" xmlns:cx7="http://schemas.microsoft.com/office/drawing/2016/5/13/chartex" xmlns:cx8="http://schemas.microsoft.com/office/drawing/2016/5/14/chartex" xmlns:mc="http://schemas.openxmlformats.org/markup-compatibility/2006" xmlns:aink="http://schemas.microsoft.com/office/drawing/2016/ink" xmlns:am3d="http://schemas.microsoft.com/office/drawing/2017/model3d" xmlns:o="urn:schemas-microsoft-com:office:office" xmlns:oel="http://schemas.microsoft.com/office/2019/extlst" xmlns:r="http://schemas.openxmlformats.org/officeDocument/2006/relationships" xmlns:m="http://schemas.openxmlformats.org/officeDocument/2006/math" xmlns:v="urn:schemas-microsoft-com:vml" xmlns:wp14="http://schemas.microsoft.com/office/word/2010/wordprocessingDrawing" xmlns:wp="http://schemas.openxmlformats.org/drawingml/2006/wordprocessingDrawing" xmlns:w10="urn:schemas-microsoft-com:office:word" xmlns:w="http://schemas.openxmlformats.org/wordprocessingml/2006/main" xmlns:w14="http://schemas.microsoft.com/office/word/2010/wordml" xmlns:w15="http://schemas.microsoft.com/office/word/2012/wordml" xmlns:w16cex="http://schemas.microsoft.com/office/word/2018/wordml/cex" xmlns:w16cid="http://schemas.microsoft.com/office/word/2016/wordml/cid" xmlns:w16="http://schemas.microsoft.com/office/word/2018/wordml" xmlns:w16du="http://schemas.microsoft.com/office/word/2023/wordml/word16du" xmlns:w16sdtdh="http://schemas.microsoft.com/office/word/2020/wordml/sdtdatahash" xmlns:w16sdtfl="http://schemas.microsoft.com/office/word/2024/wordml/sdtformatlock" xmlns:w16se="http://schemas.microsoft.com/office/word/2015/wordml/symex" xmlns:wpg="http://schemas.microsoft.com/office/word/2010/wordprocessingGroup" xmlns:wpi="http://schemas.microsoft.com/office/word/2010/wordprocessingInk" xmlns:wne="http://schemas.microsoft.com/office/word/2006/wordml" xmlns:wps="http://schemas.microsoft.com/office/word/2010/wordprocessingShape" mc:Ignorable="w14 w15 w16se w16cid w16 w16cex w16sdtdh w16sdtfl w16du wp14">
   <w:body>
+    <w:p/>
     <w:p>
       <w:r>
         <w:drawing>
-          <wp:inline distT="0" distB="0" distL="0" distR="0" wp14:anchorId="56988B2B" wp14:editId="1AEDDFE5">
-            <wp:extent cx="5943600" cy="4169410"/>
+          <wp:inline distT="0" distB="0" distL="0" distR="0" wp14:anchorId="50AA8996" wp14:editId="4D58BBC2">
+            <wp:extent cx="4343400" cy="4654296"/>
             <wp:effectExtent l="0" t="0" r="0" b="0"/>
-            <wp:docPr id="972675110" name="Picture 1" descr="A screenshot of a computer&#10;&#10;AI-generated content may be incorrect."/>
+            <wp:docPr id="1492144124" name="Picture 1" descr="A screenshot of a computer&#10;&#10;AI-generated content may be incorrect."/>
             <wp:cNvGraphicFramePr>
               <a:graphicFrameLocks xmlns:a="http://schemas.openxmlformats.org/drawingml/2006/main" noChangeAspect="1"/>
             </wp:cNvGraphicFramePr>
@@ -16,8 +17,8 @@
               <a:graphicData uri="http://schemas.openxmlformats.org/drawingml/2006/picture">
                 <pic:pic xmlns:pic="http://schemas.openxmlformats.org/drawingml/2006/picture">
                   <pic:nvPicPr>
-                    <pic:cNvPr id="972675110" name="Picture 1" descr="A screenshot of a computer&#10;&#10;AI-generated content may be incorrect."/>
-                    <pic:cNvPicPr/>
+                    <pic:cNvPr id="1492144124" name="Picture 1" descr="A screenshot of a computer&#10;&#10;AI-generated content may be incorrect."/>
+                    <pic:cNvPicPr preferRelativeResize="0"/>
                   </pic:nvPicPr>
                   <pic:blipFill>
                     <a:blip r:embed="rId4"/>
@@ -28,47 +29,7 @@
                   <pic:spPr>
                     <a:xfrm>
                       <a:off x="0" y="0"/>
-                      <a:ext cx="5943600" cy="4169410"/>
-                    </a:xfrm>
-                    <a:prstGeom prst="rect">
-                      <a:avLst/>
-                    </a:prstGeom>
-                  </pic:spPr>
-                </pic:pic>
-              </a:graphicData>
-            </a:graphic>
-          </wp:inline>
-        </w:drawing>
-      </w:r>
-    </w:p>
-    <w:p>
-      <w:r>
-        <w:lastRenderedPageBreak/>
-        <w:drawing>
-          <wp:inline distT="0" distB="0" distL="0" distR="0" wp14:anchorId="18290844" wp14:editId="61A0A62D">
-            <wp:extent cx="5943600" cy="4074795"/>
-            <wp:effectExtent l="0" t="0" r="0" b="1905"/>
-            <wp:docPr id="1052473830" name="Picture 1" descr="A screenshot of a computer&#10;&#10;AI-generated content may be incorrect."/>
-            <wp:cNvGraphicFramePr>
-              <a:graphicFrameLocks xmlns:a="http://schemas.openxmlformats.org/drawingml/2006/main" noChangeAspect="1"/>
-            </wp:cNvGraphicFramePr>
-            <a:graphic xmlns:a="http://schemas.openxmlformats.org/drawingml/2006/main">
-              <a:graphicData uri="http://schemas.openxmlformats.org/drawingml/2006/picture">
-                <pic:pic xmlns:pic="http://schemas.openxmlformats.org/drawingml/2006/picture">
-                  <pic:nvPicPr>
-                    <pic:cNvPr id="1052473830" name="Picture 1" descr="A screenshot of a computer&#10;&#10;AI-generated content may be incorrect."/>
-                    <pic:cNvPicPr/>
-                  </pic:nvPicPr>
-                  <pic:blipFill>
-                    <a:blip r:embed="rId5"/>
-                    <a:stretch>
-                      <a:fillRect/>
-                    </a:stretch>
-                  </pic:blipFill>
-                  <pic:spPr>
-                    <a:xfrm>
-                      <a:off x="0" y="0"/>
-                      <a:ext cx="5943600" cy="4074795"/>
+                      <a:ext cx="4343400" cy="4654296"/>
                     </a:xfrm>
                     <a:prstGeom prst="rect">
                       <a:avLst/>

</xml_diff>